<commit_message>
docs: 0.8.0 manual docx
</commit_message>
<xml_diff>
--- a/manual/可塑性记忆-使用手册-0.8.0.docx
+++ b/manual/可塑性记忆-使用手册-0.8.0.docx
@@ -6251,7 +6251,7 @@
           <w:color w:val="24343A"/>
           <w:sz w:val="21"/>
         </w:rPr>
-        <w:t>她真的说出某个候选时，会写一条低重要度记忆（fact_key=meme:&lt;slug&gt;，tags 带「梗」和场景）；在控制台长期记忆搜「梗」能看、能删。换梗库时先备份，再替换成同表同字段的 SQLite，桥接按修改时间自动重载。</w:t>
+        <w:t>安装：桥接需要打玩梗补丁（node bridge/install-meme-play.mjs --target &lt;桥接目录&gt; --apply）后重启；控制台「玩梗」页可开关和搜梗。</w:t>
       </w:r>
     </w:p>
     <w:p>
@@ -6266,7 +6266,22 @@
           <w:color w:val="24343A"/>
           <w:sz w:val="21"/>
         </w:rPr>
-        <w:t>数据说明：这批词条是本地导入的第三方梗解释合集（6668 条，构建于 2026-10-26），不是本项目原创，也不随安装包分发；每条 origin 记录具体出处，使用前请核对原始来源和平台规则。</w:t>
+        <w:t>她真的说出某个候选时，会写一条低重要度记忆（fact_key=meme:&lt;slug&gt;，tags 带「梗」和场景）；在控制台长期记忆搜「梗」能看、能删。换梗库时先备份，再替换成同表同字段的 SQLite，桥接按修改时间自动重载。</w:t>
+      </w:r>
+    </w:p>
+    <w:p>
+      <w:pPr>
+        <w:spacing w:before="0" w:after="120" w:line="360" w:lineRule="auto"/>
+      </w:pPr>
+      <w:r>
+        <w:rPr>
+          <w:rFonts w:ascii="Microsoft YaHei" w:hAnsi="Microsoft YaHei" w:eastAsia="Microsoft YaHei"/>
+          <w:b w:val="0"/>
+          <w:i w:val="0"/>
+          <w:color w:val="24343A"/>
+          <w:sz w:val="21"/>
+        </w:rPr>
+        <w:t>数据说明：词条来自开源项目 astrbot_plugin_memewiki（github.com/in1t1a1/astrbot_plugin_memewiki，MIT）随包的 6668 条快照，内容源自 cnmeme.wiki 公开 API；不是本项目原创，也不随本插件安装包分发。每条 origin 保留出处，使用或再分发前请核对上游规则。</w:t>
       </w:r>
     </w:p>
     <w:p>

</xml_diff>